<commit_message>
Fix stale figures in docs: 575->520, 64B->58B in Pitch/Comparative; add Mwita binding-order nuance to AI Bill and Legal Eval
</commit_message>
<xml_diff>
--- a/docs/Comparative_Welfare_Research.docx
+++ b/docs/Comparative_Welfare_Research.docx
@@ -728,37 +728,37 @@
         <w:rPr>
           <w:b/>
         </w:rPr>
-        <w:t>AGI v2.1 Integration:</w:t>
+        <w:t xml:space="preserve">AGI v2.1 Integration: Uses Rwanda's success as the financial benchmark for compliance modeling. By applying 7 logical deductions (such as ASAL land discounts, dependency allowances, and digital debt exclusion), the AGI model recalculates a fair premium that citizens trust. This trust drives compliance to a target of 60%, increasing overall revenue from KSh 90B to a sustainable KSh 58B from the informal sector base alone.</w:t>
       </w:r>
       <w:r>
-        <w:t xml:space="preserve"> Uses Rwanda's success as the financial benchmark for compliance modeling. By applying </w:t>
+        <w:t xml:space="preserve"/>
       </w:r>
       <w:r>
         <w:rPr>
           <w:b/>
         </w:rPr>
-        <w:t>7 logical deductions</w:t>
+        <w:t/>
       </w:r>
       <w:r>
-        <w:t xml:space="preserve"> (such as ASAL land discounts, dependency allowances, and digital debt exclusion), the AGI model recalculates a fair premium that citizens trust. This trust drives compliance to a target of </w:t>
+        <w:t xml:space="preserve"/>
       </w:r>
       <w:r>
         <w:rPr>
           <w:b/>
         </w:rPr>
-        <w:t>60%</w:t>
+        <w:t/>
       </w:r>
       <w:r>
-        <w:t xml:space="preserve">, increasing overall revenue from KSh 90B to a sustainable </w:t>
+        <w:t xml:space="preserve"/>
       </w:r>
       <w:r>
         <w:rPr>
           <w:b/>
         </w:rPr>
-        <w:t>KSh 64B</w:t>
+        <w:t/>
       </w:r>
       <w:r>
-        <w:t xml:space="preserve"> from the informal sector base alone.</w:t>
+        <w:t xml:space="preserve"/>
       </w:r>
     </w:p>
     <w:p>

</xml_diff>